<commit_message>
Corrige SICMA-REQ, ACT, CUS 1.1 y ARQ 1.0: matriz con 2 roles nuevos, AD-09 redibujado, RN-03 y CU-20 alineados con el código
Co-Authored-By: Claude Sonnet 5.5 <noreply@anthropic.com>
Claude-Session: https://claude.ai/code/session_01A5yFqx2DQWq2C9ytx8Wgdf
</commit_message>
<xml_diff>
--- a/Fase 2/Evidencias del Proyecto/SICMA_ACT_v1.1.docx
+++ b/Fase 2/Evidencias del Proyecto/SICMA_ACT_v1.1.docx
@@ -518,7 +518,7 @@
         <w:tab/>
       </w:r>
       <w:r>
-        <w:t>14</w:t>
+        <w:t>13</w:t>
       </w:r>
     </w:p>
     <w:p>
@@ -1313,7 +1313,7 @@
               <w:rPr>
                 <w:sz w:val="18"/>
               </w:rPr>
-              <w:t>Se actualizan los diagramas AD-06 y AD-07 con el código del 25 de octubre (commit 59710a5d): enrolamiento de personal externo con el lector SecuGen y plantillas cifradas solo en el PC del lector, y registro de accesos con la clave del agente y los permisos por día. Se cierran D-02 y D-03.</w:t>
+              <w:t>Se actualizan los diagramas AD-06 y AD-07 con el código del 25 de octubre (commit 59710a5d): enrolamiento de personal externo con el lector SecuGen y plantillas cifradas solo en el PC del lector, y registro de accesos con la clave del agente y los permisos por día. Se cierran D-02 y D-03. Corrección del mismo día: AD-09 se redibuja con el flujo real (la asignación no cambia el estado; cierre como Ejecutada o Fallida) y se anota que RI-17 no está en el código.</w:t>
             </w:r>
           </w:p>
         </w:tc>
@@ -3015,7 +3015,7 @@
       <w:r>
         <w:drawing>
           <wp:inline>
-            <wp:extent cx="3733800" cy="5286274"/>
+            <wp:extent cx="3733800" cy="2944812"/>
             <wp:effectExtent b="0" l="0" r="0" t="0"/>
             <wp:docPr descr="CU-21 a CU-23 · 4 calles, 3 decisiones" title="" id="56" name="Picture"/>
             <a:graphic>
@@ -3036,7 +3036,7 @@
                   <pic:spPr bwMode="auto">
                     <a:xfrm>
                       <a:off x="0" y="0"/>
-                      <a:ext cx="3733800" cy="5286274"/>
+                      <a:ext cx="3733800" cy="2944812"/>
                     </a:xfrm>
                     <a:prstGeom prst="rect">
                       <a:avLst/>
@@ -3060,7 +3060,7 @@
         <w:pStyle w:val="ImageCaption"/>
       </w:pPr>
       <w:r>
-        <w:t xml:space="preserve">CU-21 a CU-23 · 4 calles, 3 decisiones</w:t>
+        <w:t>CU-21 a CU-23 · 3 calles, 2 decisiones</w:t>
       </w:r>
     </w:p>
     <w:p>
@@ -3074,7 +3074,7 @@
         <w:rPr>
           <w:sz w:val="22"/>
         </w:rPr>
-        <w:t xml:space="preserve">El Administrador elige un técnico para una intervención Aprobada. Si el técnico ya tiene otra intervención en ese horario, SICMA avisa y el Administrador elige otro (RI-17). Con el técnico disponible, SICMA guarda la asignación y agenda en el calendario compartido; si el calendario falla, la asignación queda guardada y se reintenta el agendamiento. La intervención pasa a Asignada y SICMA avisa el cambio a los involucrados. Solo el Técnico asignado puede iniciarla y registrar lo realizado; sin resultado no se puede cerrar. Cada cambio de estado queda en el historial (RI-18).</w:t>
+        <w:t>El Administrador elige el técnico, el horario, los activos y el personal externo de una intervención Aprobada; en cualquier otro estado SICMA rechaza la acción. SICMA guarda la asignación, crea los permisos de acceso del personal externo y pide agendar la cita enviando un correo al flujo de Power Automate. La intervención sigue Aprobada: no existe un estado Asignada. El personal externo verifica su huella desde 1 hora antes del inicio. Para iniciarla debe haber técnico asignado y todo el personal verificado; solo el técnico asignado o un Administrador pueden hacerlo, y la intervención pasa a En ejecución. Al cerrarla, el técnico registra el resultado y una observación: queda Ejecutada o Fallida, se revocan los permisos del personal externo y SICMA avisa el cambio a los involucrados. Solo el Técnico asignado puede iniciarla y registrar lo realizado; sin resultado no se puede cerrar. Cada cambio de estado queda en el historial (RI-18).</w:t>
       </w:r>
     </w:p>
     <w:bookmarkEnd w:id="58"/>
@@ -4915,7 +4915,7 @@
         <w:rPr>
           <w:sz w:val="22"/>
         </w:rPr>
-        <w:t xml:space="preserve">Estados de una intervención usados aquí: Pendiente, Aprobada, Rechazada, Asignada, En ejecución y Cerrada. Son los mismos de SICMA-CUS y SICMA-CLA.</w:t>
+        <w:t>Estados de una intervención en el código: Pendiente, Aprobada, Rechazada, En ejecución, Ejecutada, Fallida y Cancelada; el modelo declara también CambiosSolicitados, que ningún flujo asigna. SICMA-CUS y SICMA-CLA todavía hablan de Asignada y Cerrada. La regla RI-17 (un técnico no puede tener dos intervenciones en el mismo horario) no está en el código.</w:t>
       </w:r>
     </w:p>
     <w:bookmarkEnd w:id="61"/>

</xml_diff>

<commit_message>
Quita el cruce de horarios del técnico de CUS, ACT, MCK y CPR (el código no lo controla)
Co-Authored-By: Claude Sonnet 5.5 <noreply@anthropic.com>
Claude-Session: https://claude.ai/code/session_01A5yFqx2DQWq2C9ytx8Wgdf
</commit_message>
<xml_diff>
--- a/Fase 2/Evidencias del Proyecto/SICMA_ACT_v1.1.docx
+++ b/Fase 2/Evidencias del Proyecto/SICMA_ACT_v1.1.docx
@@ -1313,7 +1313,7 @@
               <w:rPr>
                 <w:sz w:val="18"/>
               </w:rPr>
-              <w:t>Se actualizan los diagramas AD-06 y AD-07 con el código del 25 de octubre (commit 59710a5d): enrolamiento de personal externo con el lector SecuGen y plantillas cifradas solo en el PC del lector, y registro de accesos con la clave del agente y los permisos por día. Se cierran D-02 y D-03. Corrección del mismo día: AD-09 se redibuja con el flujo real (la asignación no cambia el estado; cierre como Ejecutada o Fallida) y se anota que RI-17 no está en el código.</w:t>
+              <w:t>Se actualizan los diagramas AD-06 y AD-07 con el código del 25 de octubre (commit 59710a5d): enrolamiento de personal externo con el lector SecuGen y plantillas cifradas solo en el PC del lector, y registro de accesos con la clave del agente y los permisos por día. Se cierran D-02 y D-03. Corrección del mismo día: AD-09 se redibuja con el flujo real (la asignación no cambia el estado; cierre como Ejecutada o Fallida).</w:t>
             </w:r>
           </w:p>
         </w:tc>
@@ -4915,7 +4915,7 @@
         <w:rPr>
           <w:sz w:val="22"/>
         </w:rPr>
-        <w:t>Estados de una intervención en el código: Pendiente, Aprobada, Rechazada, En ejecución, Ejecutada, Fallida y Cancelada; el modelo declara también CambiosSolicitados, que ningún flujo asigna. SICMA-CUS y SICMA-CLA todavía hablan de Asignada y Cerrada. La regla RI-17 (un técnico no puede tener dos intervenciones en el mismo horario) no está en el código.</w:t>
+        <w:t>Estados de una intervención en el código: Pendiente, Aprobada, Rechazada, En ejecución, Ejecutada, Fallida y Cancelada; el modelo declara también CambiosSolicitados, que ningún flujo asigna. SICMA-CUS y SICMA-CLA todavía hablan de Asignada y Cerrada.</w:t>
       </w:r>
     </w:p>
     <w:bookmarkEnd w:id="61"/>

</xml_diff>

<commit_message>
Alinea los estados de la intervención con el código en CLA, CPR, BDD, MCK, ACT y ARQ
Co-Authored-By: Claude Sonnet 5.5 <noreply@anthropic.com>
Claude-Session: https://claude.ai/code/session_01A5yFqx2DQWq2C9ytx8Wgdf
</commit_message>
<xml_diff>
--- a/Fase 2/Evidencias del Proyecto/SICMA_ACT_v1.1.docx
+++ b/Fase 2/Evidencias del Proyecto/SICMA_ACT_v1.1.docx
@@ -4915,7 +4915,7 @@
         <w:rPr>
           <w:sz w:val="22"/>
         </w:rPr>
-        <w:t>Estados de una intervención en el código: Pendiente, Aprobada, Rechazada, En ejecución, Ejecutada, Fallida y Cancelada; el modelo declara también CambiosSolicitados, que ningún flujo asigna. SICMA-CUS y SICMA-CLA todavía hablan de Asignada y Cerrada.</w:t>
+        <w:t>Estados de una intervención en el código: Pendiente, Aprobada, Rechazada, En ejecución, Ejecutada, Fallida y Cancelada; el modelo declara también CambiosSolicitados, que ningún flujo asigna.</w:t>
       </w:r>
     </w:p>
     <w:bookmarkEnd w:id="61"/>
@@ -5203,7 +5203,7 @@
               <w:rPr>
                 <w:sz w:val="18"/>
               </w:rPr>
-              <w:t xml:space="preserve">Pendiente, Aprobada, Rechazada, Asignada, En ejecución, Cerrada</w:t>
+              <w:t>Pendiente, Aprobada, Rechazada, En ejecución, Ejecutada, Fallida, Cancelada</w:t>
             </w:r>
           </w:p>
         </w:tc>

</xml_diff>

<commit_message>
Quita el estado CambiosSolicitados de los documentos y de openapi.yaml
Co-Authored-By: Claude Sonnet 5.5 <noreply@anthropic.com>
Claude-Session: https://claude.ai/code/session_01A5yFqx2DQWq2C9ytx8Wgdf
</commit_message>
<xml_diff>
--- a/Fase 2/Evidencias del Proyecto/SICMA_ACT_v1.1.docx
+++ b/Fase 2/Evidencias del Proyecto/SICMA_ACT_v1.1.docx
@@ -1313,7 +1313,7 @@
               <w:rPr>
                 <w:sz w:val="18"/>
               </w:rPr>
-              <w:t>Se actualizan los diagramas AD-06 y AD-07 con el código del 25 de octubre (commit 59710a5d): enrolamiento de personal externo con el lector SecuGen y plantillas cifradas solo en el PC del lector, y registro de accesos con la clave del agente y los permisos por día. Se cierran D-02 y D-03. Corrección del mismo día: AD-09 se redibuja con el flujo real (la asignación no cambia el estado; cierre como Ejecutada o Fallida).</w:t>
+              <w:t>Se actualizan los diagramas AD-06 y AD-07 con el código del 25 de octubre (commit 59710a5d): enrolamiento de personal externo con el lector SecuGen y plantillas cifradas solo en el PC del lector, y registro de accesos con la clave del agente y los permisos por día. Se cierran D-02 y D-03. Corrección del mismo día: AD-09 se redibuja con el flujo real (la asignación no cambia el estado; cierre como Ejecutada o Fallida). Se quita la mención del estado CambiosSolicitados.</w:t>
             </w:r>
           </w:p>
         </w:tc>
@@ -4915,7 +4915,7 @@
         <w:rPr>
           <w:sz w:val="22"/>
         </w:rPr>
-        <w:t>Estados de una intervención en el código: Pendiente, Aprobada, Rechazada, En ejecución, Ejecutada, Fallida y Cancelada; el modelo declara también CambiosSolicitados, que ningún flujo asigna.</w:t>
+        <w:t>Estados de una intervención en el código: Pendiente, Aprobada, Rechazada, En ejecución, Ejecutada, Fallida y Cancelada.</w:t>
       </w:r>
     </w:p>
     <w:bookmarkEnd w:id="61"/>

</xml_diff>

<commit_message>
Documentos con cambios revisados y actualizados.
</commit_message>
<xml_diff>
--- a/Fase 2/Evidencias del Proyecto/SICMA_ACT_v1.1.docx
+++ b/Fase 2/Evidencias del Proyecto/SICMA_ACT_v1.1.docx
@@ -593,7 +593,7 @@
     <w:tbl>
       <w:tblPr>
         <w:tblStyle w:val="Table"/>
-        <w:tblW w:type="auto" w:w="0"/>
+        <w:tblW w:type="pct" w:w="5000"/>
         <w:tblLook w:firstRow="1" w:lastRow="0" w:firstColumn="0" w:lastColumn="0" w:noHBand="0" w:noVBand="0" w:val="0020"/>
         <w:jc w:val="start"/>
         <w:tblBorders>
@@ -606,8 +606,8 @@
         </w:tblBorders>
       </w:tblPr>
       <w:tblGrid>
-        <w:gridCol w:w="3585"/>
-        <w:gridCol w:w="4330"/>
+        <w:gridCol w:w="4003"/>
+        <w:gridCol w:w="4835"/>
       </w:tblGrid>
       <w:tr>
         <w:trPr>
@@ -616,7 +616,7 @@
         </w:trPr>
         <w:tc>
           <w:tcPr>
-            <w:tcW w:w="3585" w:type="dxa"/>
+            <w:tcW w:w="4003" w:type="dxa"/>
             <w:shd w:val="clear" w:color="auto" w:fill="D9E2F3"/>
           </w:tcPr>
           <w:p>
@@ -635,7 +635,7 @@
         </w:tc>
         <w:tc>
           <w:tcPr>
-            <w:tcW w:w="4330" w:type="dxa"/>
+            <w:tcW w:w="4835" w:type="dxa"/>
             <w:shd w:val="clear" w:color="auto" w:fill="D9E2F3"/>
           </w:tcPr>
           <w:p>
@@ -659,7 +659,7 @@
         </w:trPr>
         <w:tc>
           <w:tcPr>
-            <w:tcW w:w="3585" w:type="dxa"/>
+            <w:tcW w:w="4003" w:type="dxa"/>
           </w:tcPr>
           <w:p>
             <w:pPr>
@@ -676,7 +676,7 @@
         </w:tc>
         <w:tc>
           <w:tcPr>
-            <w:tcW w:w="4330" w:type="dxa"/>
+            <w:tcW w:w="4835" w:type="dxa"/>
           </w:tcPr>
           <w:p>
             <w:pPr>
@@ -698,7 +698,7 @@
         </w:trPr>
         <w:tc>
           <w:tcPr>
-            <w:tcW w:w="3585" w:type="dxa"/>
+            <w:tcW w:w="4003" w:type="dxa"/>
           </w:tcPr>
           <w:p>
             <w:pPr>
@@ -715,7 +715,7 @@
         </w:tc>
         <w:tc>
           <w:tcPr>
-            <w:tcW w:w="4330" w:type="dxa"/>
+            <w:tcW w:w="4835" w:type="dxa"/>
           </w:tcPr>
           <w:p>
             <w:pPr>
@@ -737,7 +737,7 @@
         </w:trPr>
         <w:tc>
           <w:tcPr>
-            <w:tcW w:w="3585" w:type="dxa"/>
+            <w:tcW w:w="4003" w:type="dxa"/>
           </w:tcPr>
           <w:p>
             <w:pPr>
@@ -754,7 +754,7 @@
         </w:tc>
         <w:tc>
           <w:tcPr>
-            <w:tcW w:w="4330" w:type="dxa"/>
+            <w:tcW w:w="4835" w:type="dxa"/>
           </w:tcPr>
           <w:p>
             <w:pPr>
@@ -776,7 +776,7 @@
         </w:trPr>
         <w:tc>
           <w:tcPr>
-            <w:tcW w:w="3585" w:type="dxa"/>
+            <w:tcW w:w="4003" w:type="dxa"/>
           </w:tcPr>
           <w:p>
             <w:pPr>
@@ -793,7 +793,7 @@
         </w:tc>
         <w:tc>
           <w:tcPr>
-            <w:tcW w:w="4330" w:type="dxa"/>
+            <w:tcW w:w="4835" w:type="dxa"/>
           </w:tcPr>
           <w:p>
             <w:pPr>
@@ -815,7 +815,7 @@
         </w:trPr>
         <w:tc>
           <w:tcPr>
-            <w:tcW w:w="3585" w:type="dxa"/>
+            <w:tcW w:w="4003" w:type="dxa"/>
           </w:tcPr>
           <w:p>
             <w:pPr>
@@ -832,7 +832,7 @@
         </w:tc>
         <w:tc>
           <w:tcPr>
-            <w:tcW w:w="4330" w:type="dxa"/>
+            <w:tcW w:w="4835" w:type="dxa"/>
           </w:tcPr>
           <w:p>
             <w:pPr>
@@ -869,7 +869,7 @@
         <w:gridCol w:w="972"/>
         <w:gridCol w:w="1237"/>
         <w:gridCol w:w="1502"/>
-        <w:gridCol w:w="5126"/>
+        <w:gridCol w:w="5127"/>
       </w:tblGrid>
       <w:tr>
         <w:trPr>
@@ -935,7 +935,7 @@
         </w:tc>
         <w:tc>
           <w:tcPr>
-            <w:tcW w:w="5126" w:type="dxa"/>
+            <w:tcW w:w="5127" w:type="dxa"/>
             <w:shd w:val="clear" w:color="auto" w:fill="D9E2F3"/>
           </w:tcPr>
           <w:p>
@@ -1010,7 +1010,7 @@
         </w:tc>
         <w:tc>
           <w:tcPr>
-            <w:tcW w:w="5126" w:type="dxa"/>
+            <w:tcW w:w="5127" w:type="dxa"/>
           </w:tcPr>
           <w:p>
             <w:pPr>
@@ -1083,7 +1083,7 @@
         </w:tc>
         <w:tc>
           <w:tcPr>
-            <w:tcW w:w="5126" w:type="dxa"/>
+            <w:tcW w:w="5127" w:type="dxa"/>
           </w:tcPr>
           <w:p>
             <w:pPr>
@@ -1156,7 +1156,7 @@
         </w:tc>
         <w:tc>
           <w:tcPr>
-            <w:tcW w:w="5126" w:type="dxa"/>
+            <w:tcW w:w="5127" w:type="dxa"/>
           </w:tcPr>
           <w:p>
             <w:pPr>
@@ -1229,7 +1229,7 @@
         </w:tc>
         <w:tc>
           <w:tcPr>
-            <w:tcW w:w="5126" w:type="dxa"/>
+            <w:tcW w:w="5127" w:type="dxa"/>
           </w:tcPr>
           <w:p>
             <w:pPr>
@@ -1302,7 +1302,7 @@
         </w:tc>
         <w:tc>
           <w:tcPr>
-            <w:tcW w:w="5126" w:type="dxa"/>
+            <w:tcW w:w="5127" w:type="dxa"/>
           </w:tcPr>
           <w:p>
             <w:pPr>
@@ -1360,7 +1360,7 @@
     <w:tbl>
       <w:tblPr>
         <w:tblStyle w:val="Table"/>
-        <w:tblW w:type="auto" w:w="0"/>
+        <w:tblW w:type="pct" w:w="5000"/>
         <w:tblLook w:firstRow="1" w:lastRow="0" w:firstColumn="0" w:lastColumn="0" w:noHBand="0" w:noVBand="0" w:val="0020"/>
         <w:jc w:val="start"/>
         <w:tblBorders>
@@ -1373,9 +1373,9 @@
         </w:tblBorders>
       </w:tblPr>
       <w:tblGrid>
-        <w:gridCol w:w="1922"/>
-        <w:gridCol w:w="3743"/>
-        <w:gridCol w:w="2248"/>
+        <w:gridCol w:w="2147"/>
+        <w:gridCol w:w="4181"/>
+        <w:gridCol w:w="2510"/>
       </w:tblGrid>
       <w:tr>
         <w:trPr>
@@ -1384,7 +1384,7 @@
         </w:trPr>
         <w:tc>
           <w:tcPr>
-            <w:tcW w:w="1922" w:type="dxa"/>
+            <w:tcW w:w="2147" w:type="dxa"/>
             <w:shd w:val="clear" w:color="auto" w:fill="D9E2F3"/>
           </w:tcPr>
           <w:p>
@@ -1403,7 +1403,7 @@
         </w:tc>
         <w:tc>
           <w:tcPr>
-            <w:tcW w:w="3743" w:type="dxa"/>
+            <w:tcW w:w="4181" w:type="dxa"/>
             <w:shd w:val="clear" w:color="auto" w:fill="D9E2F3"/>
           </w:tcPr>
           <w:p>
@@ -1422,7 +1422,7 @@
         </w:tc>
         <w:tc>
           <w:tcPr>
-            <w:tcW w:w="2248" w:type="dxa"/>
+            <w:tcW w:w="2510" w:type="dxa"/>
             <w:shd w:val="clear" w:color="auto" w:fill="D9E2F3"/>
           </w:tcPr>
           <w:p>
@@ -1446,7 +1446,7 @@
         </w:trPr>
         <w:tc>
           <w:tcPr>
-            <w:tcW w:w="1922" w:type="dxa"/>
+            <w:tcW w:w="2147" w:type="dxa"/>
           </w:tcPr>
           <w:p>
             <w:pPr>
@@ -1463,7 +1463,7 @@
         </w:tc>
         <w:tc>
           <w:tcPr>
-            <w:tcW w:w="3743" w:type="dxa"/>
+            <w:tcW w:w="4181" w:type="dxa"/>
           </w:tcPr>
           <w:p>
             <w:pPr>
@@ -1480,7 +1480,7 @@
         </w:tc>
         <w:tc>
           <w:tcPr>
-            <w:tcW w:w="2248" w:type="dxa"/>
+            <w:tcW w:w="2510" w:type="dxa"/>
           </w:tcPr>
           <w:p>
             <w:pPr>
@@ -1502,7 +1502,7 @@
         </w:trPr>
         <w:tc>
           <w:tcPr>
-            <w:tcW w:w="1922" w:type="dxa"/>
+            <w:tcW w:w="2147" w:type="dxa"/>
           </w:tcPr>
           <w:p>
             <w:pPr>
@@ -1519,7 +1519,7 @@
         </w:tc>
         <w:tc>
           <w:tcPr>
-            <w:tcW w:w="3743" w:type="dxa"/>
+            <w:tcW w:w="4181" w:type="dxa"/>
           </w:tcPr>
           <w:p>
             <w:pPr>
@@ -1536,7 +1536,7 @@
         </w:tc>
         <w:tc>
           <w:tcPr>
-            <w:tcW w:w="2248" w:type="dxa"/>
+            <w:tcW w:w="2510" w:type="dxa"/>
           </w:tcPr>
           <w:p>
             <w:pPr>
@@ -1558,7 +1558,7 @@
         </w:trPr>
         <w:tc>
           <w:tcPr>
-            <w:tcW w:w="1922" w:type="dxa"/>
+            <w:tcW w:w="2147" w:type="dxa"/>
           </w:tcPr>
           <w:p>
             <w:pPr>
@@ -1575,7 +1575,7 @@
         </w:tc>
         <w:tc>
           <w:tcPr>
-            <w:tcW w:w="3743" w:type="dxa"/>
+            <w:tcW w:w="4181" w:type="dxa"/>
           </w:tcPr>
           <w:p>
             <w:pPr>
@@ -1592,7 +1592,7 @@
         </w:tc>
         <w:tc>
           <w:tcPr>
-            <w:tcW w:w="2248" w:type="dxa"/>
+            <w:tcW w:w="2510" w:type="dxa"/>
           </w:tcPr>
           <w:p>
             <w:pPr>
@@ -1614,7 +1614,7 @@
         </w:trPr>
         <w:tc>
           <w:tcPr>
-            <w:tcW w:w="1922" w:type="dxa"/>
+            <w:tcW w:w="2147" w:type="dxa"/>
           </w:tcPr>
           <w:p>
             <w:pPr>
@@ -1631,7 +1631,7 @@
         </w:tc>
         <w:tc>
           <w:tcPr>
-            <w:tcW w:w="3743" w:type="dxa"/>
+            <w:tcW w:w="4181" w:type="dxa"/>
           </w:tcPr>
           <w:p>
             <w:pPr>
@@ -1648,7 +1648,7 @@
         </w:tc>
         <w:tc>
           <w:tcPr>
-            <w:tcW w:w="2248" w:type="dxa"/>
+            <w:tcW w:w="2510" w:type="dxa"/>
           </w:tcPr>
           <w:p>
             <w:pPr>
@@ -1670,7 +1670,7 @@
         </w:trPr>
         <w:tc>
           <w:tcPr>
-            <w:tcW w:w="1922" w:type="dxa"/>
+            <w:tcW w:w="2147" w:type="dxa"/>
           </w:tcPr>
           <w:p>
             <w:pPr>
@@ -1687,7 +1687,7 @@
         </w:tc>
         <w:tc>
           <w:tcPr>
-            <w:tcW w:w="3743" w:type="dxa"/>
+            <w:tcW w:w="4181" w:type="dxa"/>
           </w:tcPr>
           <w:p>
             <w:pPr>
@@ -1704,7 +1704,7 @@
         </w:tc>
         <w:tc>
           <w:tcPr>
-            <w:tcW w:w="2248" w:type="dxa"/>
+            <w:tcW w:w="2510" w:type="dxa"/>
           </w:tcPr>
           <w:p>
             <w:pPr>
@@ -1726,7 +1726,7 @@
         </w:trPr>
         <w:tc>
           <w:tcPr>
-            <w:tcW w:w="1922" w:type="dxa"/>
+            <w:tcW w:w="2147" w:type="dxa"/>
           </w:tcPr>
           <w:p>
             <w:pPr>
@@ -1743,7 +1743,7 @@
         </w:tc>
         <w:tc>
           <w:tcPr>
-            <w:tcW w:w="3743" w:type="dxa"/>
+            <w:tcW w:w="4181" w:type="dxa"/>
           </w:tcPr>
           <w:p>
             <w:pPr>
@@ -1760,7 +1760,7 @@
         </w:tc>
         <w:tc>
           <w:tcPr>
-            <w:tcW w:w="2248" w:type="dxa"/>
+            <w:tcW w:w="2510" w:type="dxa"/>
           </w:tcPr>
           <w:p>
             <w:pPr>
@@ -1782,7 +1782,7 @@
         </w:trPr>
         <w:tc>
           <w:tcPr>
-            <w:tcW w:w="1922" w:type="dxa"/>
+            <w:tcW w:w="2147" w:type="dxa"/>
           </w:tcPr>
           <w:p>
             <w:pPr>
@@ -1799,7 +1799,7 @@
         </w:tc>
         <w:tc>
           <w:tcPr>
-            <w:tcW w:w="3743" w:type="dxa"/>
+            <w:tcW w:w="4181" w:type="dxa"/>
           </w:tcPr>
           <w:p>
             <w:pPr>
@@ -1816,7 +1816,7 @@
         </w:tc>
         <w:tc>
           <w:tcPr>
-            <w:tcW w:w="2248" w:type="dxa"/>
+            <w:tcW w:w="2510" w:type="dxa"/>
           </w:tcPr>
           <w:p>
             <w:pPr>
@@ -1838,7 +1838,7 @@
         </w:trPr>
         <w:tc>
           <w:tcPr>
-            <w:tcW w:w="1922" w:type="dxa"/>
+            <w:tcW w:w="2147" w:type="dxa"/>
           </w:tcPr>
           <w:p>
             <w:pPr>
@@ -1855,7 +1855,7 @@
         </w:tc>
         <w:tc>
           <w:tcPr>
-            <w:tcW w:w="3743" w:type="dxa"/>
+            <w:tcW w:w="4181" w:type="dxa"/>
           </w:tcPr>
           <w:p>
             <w:pPr>
@@ -1872,7 +1872,7 @@
         </w:tc>
         <w:tc>
           <w:tcPr>
-            <w:tcW w:w="2248" w:type="dxa"/>
+            <w:tcW w:w="2510" w:type="dxa"/>
           </w:tcPr>
           <w:p>
             <w:pPr>
@@ -1894,7 +1894,7 @@
         </w:trPr>
         <w:tc>
           <w:tcPr>
-            <w:tcW w:w="1922" w:type="dxa"/>
+            <w:tcW w:w="2147" w:type="dxa"/>
           </w:tcPr>
           <w:p>
             <w:pPr>
@@ -1911,7 +1911,7 @@
         </w:tc>
         <w:tc>
           <w:tcPr>
-            <w:tcW w:w="3743" w:type="dxa"/>
+            <w:tcW w:w="4181" w:type="dxa"/>
           </w:tcPr>
           <w:p>
             <w:pPr>
@@ -1928,7 +1928,7 @@
         </w:tc>
         <w:tc>
           <w:tcPr>
-            <w:tcW w:w="2248" w:type="dxa"/>
+            <w:tcW w:w="2510" w:type="dxa"/>
           </w:tcPr>
           <w:p>
             <w:pPr>
@@ -1986,7 +1986,7 @@
     <w:tbl>
       <w:tblPr>
         <w:tblStyle w:val="Table"/>
-        <w:tblW w:type="auto" w:w="0"/>
+        <w:tblW w:type="pct" w:w="5000"/>
         <w:tblLook w:firstRow="1" w:lastRow="0" w:firstColumn="0" w:lastColumn="0" w:noHBand="0" w:noVBand="0" w:val="0020"/>
         <w:jc w:val="start"/>
         <w:tblBorders>
@@ -1999,8 +1999,8 @@
         </w:tblBorders>
       </w:tblPr>
       <w:tblGrid>
-        <w:gridCol w:w="3296"/>
-        <w:gridCol w:w="4619"/>
+        <w:gridCol w:w="3680"/>
+        <w:gridCol w:w="5158"/>
       </w:tblGrid>
       <w:tr>
         <w:trPr>
@@ -2009,7 +2009,7 @@
         </w:trPr>
         <w:tc>
           <w:tcPr>
-            <w:tcW w:w="3296" w:type="dxa"/>
+            <w:tcW w:w="3680" w:type="dxa"/>
             <w:shd w:val="clear" w:color="auto" w:fill="D9E2F3"/>
           </w:tcPr>
           <w:p>
@@ -2028,7 +2028,7 @@
         </w:tc>
         <w:tc>
           <w:tcPr>
-            <w:tcW w:w="4619" w:type="dxa"/>
+            <w:tcW w:w="5158" w:type="dxa"/>
             <w:shd w:val="clear" w:color="auto" w:fill="D9E2F3"/>
           </w:tcPr>
           <w:p>
@@ -2052,7 +2052,7 @@
         </w:trPr>
         <w:tc>
           <w:tcPr>
-            <w:tcW w:w="3296" w:type="dxa"/>
+            <w:tcW w:w="3680" w:type="dxa"/>
           </w:tcPr>
           <w:p>
             <w:pPr>
@@ -2069,7 +2069,7 @@
         </w:tc>
         <w:tc>
           <w:tcPr>
-            <w:tcW w:w="4619" w:type="dxa"/>
+            <w:tcW w:w="5158" w:type="dxa"/>
           </w:tcPr>
           <w:p>
             <w:pPr>
@@ -2091,7 +2091,7 @@
         </w:trPr>
         <w:tc>
           <w:tcPr>
-            <w:tcW w:w="3296" w:type="dxa"/>
+            <w:tcW w:w="3680" w:type="dxa"/>
           </w:tcPr>
           <w:p>
             <w:pPr>
@@ -2108,7 +2108,7 @@
         </w:tc>
         <w:tc>
           <w:tcPr>
-            <w:tcW w:w="4619" w:type="dxa"/>
+            <w:tcW w:w="5158" w:type="dxa"/>
           </w:tcPr>
           <w:p>
             <w:pPr>
@@ -2130,7 +2130,7 @@
         </w:trPr>
         <w:tc>
           <w:tcPr>
-            <w:tcW w:w="3296" w:type="dxa"/>
+            <w:tcW w:w="3680" w:type="dxa"/>
           </w:tcPr>
           <w:p>
             <w:pPr>
@@ -2147,7 +2147,7 @@
         </w:tc>
         <w:tc>
           <w:tcPr>
-            <w:tcW w:w="4619" w:type="dxa"/>
+            <w:tcW w:w="5158" w:type="dxa"/>
           </w:tcPr>
           <w:p>
             <w:pPr>
@@ -2169,7 +2169,7 @@
         </w:trPr>
         <w:tc>
           <w:tcPr>
-            <w:tcW w:w="3296" w:type="dxa"/>
+            <w:tcW w:w="3680" w:type="dxa"/>
           </w:tcPr>
           <w:p>
             <w:pPr>
@@ -2186,7 +2186,7 @@
         </w:tc>
         <w:tc>
           <w:tcPr>
-            <w:tcW w:w="4619" w:type="dxa"/>
+            <w:tcW w:w="5158" w:type="dxa"/>
           </w:tcPr>
           <w:p>
             <w:pPr>
@@ -2208,7 +2208,7 @@
         </w:trPr>
         <w:tc>
           <w:tcPr>
-            <w:tcW w:w="3296" w:type="dxa"/>
+            <w:tcW w:w="3680" w:type="dxa"/>
           </w:tcPr>
           <w:p>
             <w:pPr>
@@ -2225,7 +2225,7 @@
         </w:tc>
         <w:tc>
           <w:tcPr>
-            <w:tcW w:w="4619" w:type="dxa"/>
+            <w:tcW w:w="5158" w:type="dxa"/>
           </w:tcPr>
           <w:p>
             <w:pPr>
@@ -2247,7 +2247,7 @@
         </w:trPr>
         <w:tc>
           <w:tcPr>
-            <w:tcW w:w="3296" w:type="dxa"/>
+            <w:tcW w:w="3680" w:type="dxa"/>
           </w:tcPr>
           <w:p>
             <w:pPr>
@@ -2264,7 +2264,7 @@
         </w:tc>
         <w:tc>
           <w:tcPr>
-            <w:tcW w:w="4619" w:type="dxa"/>
+            <w:tcW w:w="5158" w:type="dxa"/>
           </w:tcPr>
           <w:p>
             <w:pPr>
@@ -3118,11 +3118,11 @@
         </w:tblBorders>
       </w:tblPr>
       <w:tblGrid>
-        <w:gridCol w:w="1113"/>
-        <w:gridCol w:w="1285"/>
-        <w:gridCol w:w="2545"/>
-        <w:gridCol w:w="1616"/>
-        <w:gridCol w:w="1346"/>
+        <w:gridCol w:w="1244"/>
+        <w:gridCol w:w="1437"/>
+        <w:gridCol w:w="2845"/>
+        <w:gridCol w:w="1807"/>
+        <w:gridCol w:w="1505"/>
       </w:tblGrid>
       <w:tr>
         <w:trPr>
@@ -3131,7 +3131,7 @@
         </w:trPr>
         <w:tc>
           <w:tcPr>
-            <w:tcW w:w="1113" w:type="dxa"/>
+            <w:tcW w:w="1244" w:type="dxa"/>
             <w:shd w:val="clear" w:color="auto" w:fill="D9E2F3"/>
           </w:tcPr>
           <w:p>
@@ -3150,7 +3150,7 @@
         </w:tc>
         <w:tc>
           <w:tcPr>
-            <w:tcW w:w="1285" w:type="dxa"/>
+            <w:tcW w:w="1437" w:type="dxa"/>
             <w:shd w:val="clear" w:color="auto" w:fill="D9E2F3"/>
           </w:tcPr>
           <w:p>
@@ -3169,7 +3169,7 @@
         </w:tc>
         <w:tc>
           <w:tcPr>
-            <w:tcW w:w="2545" w:type="dxa"/>
+            <w:tcW w:w="2845" w:type="dxa"/>
             <w:shd w:val="clear" w:color="auto" w:fill="D9E2F3"/>
           </w:tcPr>
           <w:p>
@@ -3188,7 +3188,7 @@
         </w:tc>
         <w:tc>
           <w:tcPr>
-            <w:tcW w:w="1616" w:type="dxa"/>
+            <w:tcW w:w="1807" w:type="dxa"/>
             <w:shd w:val="clear" w:color="auto" w:fill="D9E2F3"/>
           </w:tcPr>
           <w:p>
@@ -3207,7 +3207,7 @@
         </w:tc>
         <w:tc>
           <w:tcPr>
-            <w:tcW w:w="1346" w:type="dxa"/>
+            <w:tcW w:w="1505" w:type="dxa"/>
             <w:shd w:val="clear" w:color="auto" w:fill="D9E2F3"/>
           </w:tcPr>
           <w:p>
@@ -3231,7 +3231,7 @@
         </w:trPr>
         <w:tc>
           <w:tcPr>
-            <w:tcW w:w="1113" w:type="dxa"/>
+            <w:tcW w:w="1244" w:type="dxa"/>
           </w:tcPr>
           <w:p>
             <w:pPr>
@@ -3248,7 +3248,7 @@
         </w:tc>
         <w:tc>
           <w:tcPr>
-            <w:tcW w:w="1285" w:type="dxa"/>
+            <w:tcW w:w="1437" w:type="dxa"/>
           </w:tcPr>
           <w:p>
             <w:pPr>
@@ -3265,7 +3265,7 @@
         </w:tc>
         <w:tc>
           <w:tcPr>
-            <w:tcW w:w="2545" w:type="dxa"/>
+            <w:tcW w:w="2845" w:type="dxa"/>
           </w:tcPr>
           <w:p>
             <w:pPr>
@@ -3282,7 +3282,7 @@
         </w:tc>
         <w:tc>
           <w:tcPr>
-            <w:tcW w:w="1616" w:type="dxa"/>
+            <w:tcW w:w="1807" w:type="dxa"/>
           </w:tcPr>
           <w:p>
             <w:pPr>
@@ -3299,7 +3299,7 @@
         </w:tc>
         <w:tc>
           <w:tcPr>
-            <w:tcW w:w="1346" w:type="dxa"/>
+            <w:tcW w:w="1505" w:type="dxa"/>
           </w:tcPr>
           <w:p>
             <w:pPr>
@@ -3321,7 +3321,7 @@
         </w:trPr>
         <w:tc>
           <w:tcPr>
-            <w:tcW w:w="1113" w:type="dxa"/>
+            <w:tcW w:w="1244" w:type="dxa"/>
           </w:tcPr>
           <w:p>
             <w:pPr>
@@ -3338,7 +3338,7 @@
         </w:tc>
         <w:tc>
           <w:tcPr>
-            <w:tcW w:w="1285" w:type="dxa"/>
+            <w:tcW w:w="1437" w:type="dxa"/>
           </w:tcPr>
           <w:p>
             <w:pPr>
@@ -3355,7 +3355,7 @@
         </w:tc>
         <w:tc>
           <w:tcPr>
-            <w:tcW w:w="2545" w:type="dxa"/>
+            <w:tcW w:w="2845" w:type="dxa"/>
           </w:tcPr>
           <w:p>
             <w:pPr>
@@ -3372,7 +3372,7 @@
         </w:tc>
         <w:tc>
           <w:tcPr>
-            <w:tcW w:w="1616" w:type="dxa"/>
+            <w:tcW w:w="1807" w:type="dxa"/>
           </w:tcPr>
           <w:p>
             <w:pPr>
@@ -3389,7 +3389,7 @@
         </w:tc>
         <w:tc>
           <w:tcPr>
-            <w:tcW w:w="1346" w:type="dxa"/>
+            <w:tcW w:w="1505" w:type="dxa"/>
           </w:tcPr>
           <w:p>
             <w:pPr>
@@ -3411,7 +3411,7 @@
         </w:trPr>
         <w:tc>
           <w:tcPr>
-            <w:tcW w:w="1113" w:type="dxa"/>
+            <w:tcW w:w="1244" w:type="dxa"/>
           </w:tcPr>
           <w:p>
             <w:pPr>
@@ -3428,7 +3428,7 @@
         </w:tc>
         <w:tc>
           <w:tcPr>
-            <w:tcW w:w="1285" w:type="dxa"/>
+            <w:tcW w:w="1437" w:type="dxa"/>
           </w:tcPr>
           <w:p>
             <w:pPr>
@@ -3445,7 +3445,7 @@
         </w:tc>
         <w:tc>
           <w:tcPr>
-            <w:tcW w:w="2545" w:type="dxa"/>
+            <w:tcW w:w="2845" w:type="dxa"/>
           </w:tcPr>
           <w:p>
             <w:pPr>
@@ -3462,7 +3462,7 @@
         </w:tc>
         <w:tc>
           <w:tcPr>
-            <w:tcW w:w="1616" w:type="dxa"/>
+            <w:tcW w:w="1807" w:type="dxa"/>
           </w:tcPr>
           <w:p>
             <w:pPr>
@@ -3479,7 +3479,7 @@
         </w:tc>
         <w:tc>
           <w:tcPr>
-            <w:tcW w:w="1346" w:type="dxa"/>
+            <w:tcW w:w="1505" w:type="dxa"/>
           </w:tcPr>
           <w:p>
             <w:pPr>
@@ -3501,7 +3501,7 @@
         </w:trPr>
         <w:tc>
           <w:tcPr>
-            <w:tcW w:w="1113" w:type="dxa"/>
+            <w:tcW w:w="1244" w:type="dxa"/>
           </w:tcPr>
           <w:p>
             <w:pPr>
@@ -3518,7 +3518,7 @@
         </w:tc>
         <w:tc>
           <w:tcPr>
-            <w:tcW w:w="1285" w:type="dxa"/>
+            <w:tcW w:w="1437" w:type="dxa"/>
           </w:tcPr>
           <w:p>
             <w:pPr>
@@ -3535,7 +3535,7 @@
         </w:tc>
         <w:tc>
           <w:tcPr>
-            <w:tcW w:w="2545" w:type="dxa"/>
+            <w:tcW w:w="2845" w:type="dxa"/>
           </w:tcPr>
           <w:p>
             <w:pPr>
@@ -3552,7 +3552,7 @@
         </w:tc>
         <w:tc>
           <w:tcPr>
-            <w:tcW w:w="1616" w:type="dxa"/>
+            <w:tcW w:w="1807" w:type="dxa"/>
           </w:tcPr>
           <w:p>
             <w:pPr>
@@ -3569,7 +3569,7 @@
         </w:tc>
         <w:tc>
           <w:tcPr>
-            <w:tcW w:w="1346" w:type="dxa"/>
+            <w:tcW w:w="1505" w:type="dxa"/>
           </w:tcPr>
           <w:p>
             <w:pPr>
@@ -3591,7 +3591,7 @@
         </w:trPr>
         <w:tc>
           <w:tcPr>
-            <w:tcW w:w="1113" w:type="dxa"/>
+            <w:tcW w:w="1244" w:type="dxa"/>
           </w:tcPr>
           <w:p>
             <w:pPr>
@@ -3608,7 +3608,7 @@
         </w:tc>
         <w:tc>
           <w:tcPr>
-            <w:tcW w:w="1285" w:type="dxa"/>
+            <w:tcW w:w="1437" w:type="dxa"/>
           </w:tcPr>
           <w:p>
             <w:pPr>
@@ -3625,7 +3625,7 @@
         </w:tc>
         <w:tc>
           <w:tcPr>
-            <w:tcW w:w="2545" w:type="dxa"/>
+            <w:tcW w:w="2845" w:type="dxa"/>
           </w:tcPr>
           <w:p>
             <w:pPr>
@@ -3642,7 +3642,7 @@
         </w:tc>
         <w:tc>
           <w:tcPr>
-            <w:tcW w:w="1616" w:type="dxa"/>
+            <w:tcW w:w="1807" w:type="dxa"/>
           </w:tcPr>
           <w:p>
             <w:pPr>
@@ -3659,7 +3659,7 @@
         </w:tc>
         <w:tc>
           <w:tcPr>
-            <w:tcW w:w="1346" w:type="dxa"/>
+            <w:tcW w:w="1505" w:type="dxa"/>
           </w:tcPr>
           <w:p>
             <w:pPr>
@@ -3681,7 +3681,7 @@
         </w:trPr>
         <w:tc>
           <w:tcPr>
-            <w:tcW w:w="1113" w:type="dxa"/>
+            <w:tcW w:w="1244" w:type="dxa"/>
           </w:tcPr>
           <w:p>
             <w:pPr>
@@ -3698,7 +3698,7 @@
         </w:tc>
         <w:tc>
           <w:tcPr>
-            <w:tcW w:w="1285" w:type="dxa"/>
+            <w:tcW w:w="1437" w:type="dxa"/>
           </w:tcPr>
           <w:p>
             <w:pPr>
@@ -3715,7 +3715,7 @@
         </w:tc>
         <w:tc>
           <w:tcPr>
-            <w:tcW w:w="2545" w:type="dxa"/>
+            <w:tcW w:w="2845" w:type="dxa"/>
           </w:tcPr>
           <w:p>
             <w:pPr>
@@ -3732,7 +3732,7 @@
         </w:tc>
         <w:tc>
           <w:tcPr>
-            <w:tcW w:w="1616" w:type="dxa"/>
+            <w:tcW w:w="1807" w:type="dxa"/>
           </w:tcPr>
           <w:p>
             <w:pPr>
@@ -3749,7 +3749,7 @@
         </w:tc>
         <w:tc>
           <w:tcPr>
-            <w:tcW w:w="1346" w:type="dxa"/>
+            <w:tcW w:w="1505" w:type="dxa"/>
           </w:tcPr>
           <w:p>
             <w:pPr>
@@ -3771,7 +3771,7 @@
         </w:trPr>
         <w:tc>
           <w:tcPr>
-            <w:tcW w:w="1113" w:type="dxa"/>
+            <w:tcW w:w="1244" w:type="dxa"/>
           </w:tcPr>
           <w:p>
             <w:pPr>
@@ -3788,7 +3788,7 @@
         </w:tc>
         <w:tc>
           <w:tcPr>
-            <w:tcW w:w="1285" w:type="dxa"/>
+            <w:tcW w:w="1437" w:type="dxa"/>
           </w:tcPr>
           <w:p>
             <w:pPr>
@@ -3805,7 +3805,7 @@
         </w:tc>
         <w:tc>
           <w:tcPr>
-            <w:tcW w:w="2545" w:type="dxa"/>
+            <w:tcW w:w="2845" w:type="dxa"/>
           </w:tcPr>
           <w:p>
             <w:pPr>
@@ -3822,7 +3822,7 @@
         </w:tc>
         <w:tc>
           <w:tcPr>
-            <w:tcW w:w="1616" w:type="dxa"/>
+            <w:tcW w:w="1807" w:type="dxa"/>
           </w:tcPr>
           <w:p>
             <w:pPr>
@@ -3839,7 +3839,7 @@
         </w:tc>
         <w:tc>
           <w:tcPr>
-            <w:tcW w:w="1346" w:type="dxa"/>
+            <w:tcW w:w="1505" w:type="dxa"/>
           </w:tcPr>
           <w:p>
             <w:pPr>
@@ -3861,7 +3861,7 @@
         </w:trPr>
         <w:tc>
           <w:tcPr>
-            <w:tcW w:w="1113" w:type="dxa"/>
+            <w:tcW w:w="1244" w:type="dxa"/>
           </w:tcPr>
           <w:p>
             <w:pPr>
@@ -3878,7 +3878,7 @@
         </w:tc>
         <w:tc>
           <w:tcPr>
-            <w:tcW w:w="1285" w:type="dxa"/>
+            <w:tcW w:w="1437" w:type="dxa"/>
           </w:tcPr>
           <w:p>
             <w:pPr>
@@ -3895,7 +3895,7 @@
         </w:tc>
         <w:tc>
           <w:tcPr>
-            <w:tcW w:w="2545" w:type="dxa"/>
+            <w:tcW w:w="2845" w:type="dxa"/>
           </w:tcPr>
           <w:p>
             <w:pPr>
@@ -3912,7 +3912,7 @@
         </w:tc>
         <w:tc>
           <w:tcPr>
-            <w:tcW w:w="1616" w:type="dxa"/>
+            <w:tcW w:w="1807" w:type="dxa"/>
           </w:tcPr>
           <w:p>
             <w:pPr>
@@ -3929,7 +3929,7 @@
         </w:tc>
         <w:tc>
           <w:tcPr>
-            <w:tcW w:w="1346" w:type="dxa"/>
+            <w:tcW w:w="1505" w:type="dxa"/>
           </w:tcPr>
           <w:p>
             <w:pPr>
@@ -3951,7 +3951,7 @@
         </w:trPr>
         <w:tc>
           <w:tcPr>
-            <w:tcW w:w="1113" w:type="dxa"/>
+            <w:tcW w:w="1244" w:type="dxa"/>
           </w:tcPr>
           <w:p>
             <w:pPr>
@@ -3968,7 +3968,7 @@
         </w:tc>
         <w:tc>
           <w:tcPr>
-            <w:tcW w:w="1285" w:type="dxa"/>
+            <w:tcW w:w="1437" w:type="dxa"/>
           </w:tcPr>
           <w:p>
             <w:pPr>
@@ -3985,7 +3985,7 @@
         </w:tc>
         <w:tc>
           <w:tcPr>
-            <w:tcW w:w="2545" w:type="dxa"/>
+            <w:tcW w:w="2845" w:type="dxa"/>
           </w:tcPr>
           <w:p>
             <w:pPr>
@@ -4002,7 +4002,7 @@
         </w:tc>
         <w:tc>
           <w:tcPr>
-            <w:tcW w:w="1616" w:type="dxa"/>
+            <w:tcW w:w="1807" w:type="dxa"/>
           </w:tcPr>
           <w:p>
             <w:pPr>
@@ -4019,7 +4019,7 @@
         </w:tc>
         <w:tc>
           <w:tcPr>
-            <w:tcW w:w="1346" w:type="dxa"/>
+            <w:tcW w:w="1505" w:type="dxa"/>
           </w:tcPr>
           <w:p>
             <w:pPr>
@@ -4076,11 +4076,11 @@
         </w:tblBorders>
       </w:tblPr>
       <w:tblGrid>
-        <w:gridCol w:w="936"/>
-        <w:gridCol w:w="2541"/>
-        <w:gridCol w:w="2254"/>
-        <w:gridCol w:w="1055"/>
-        <w:gridCol w:w="1118"/>
+        <w:gridCol w:w="1047"/>
+        <w:gridCol w:w="2841"/>
+        <w:gridCol w:w="2520"/>
+        <w:gridCol w:w="1180"/>
+        <w:gridCol w:w="1250"/>
       </w:tblGrid>
       <w:tr>
         <w:trPr>
@@ -4089,7 +4089,7 @@
         </w:trPr>
         <w:tc>
           <w:tcPr>
-            <w:tcW w:w="936" w:type="dxa"/>
+            <w:tcW w:w="1047" w:type="dxa"/>
             <w:shd w:val="clear" w:color="auto" w:fill="D9E2F3"/>
           </w:tcPr>
           <w:p>
@@ -4108,7 +4108,7 @@
         </w:tc>
         <w:tc>
           <w:tcPr>
-            <w:tcW w:w="2541" w:type="dxa"/>
+            <w:tcW w:w="2841" w:type="dxa"/>
             <w:shd w:val="clear" w:color="auto" w:fill="D9E2F3"/>
           </w:tcPr>
           <w:p>
@@ -4127,7 +4127,7 @@
         </w:tc>
         <w:tc>
           <w:tcPr>
-            <w:tcW w:w="2254" w:type="dxa"/>
+            <w:tcW w:w="2520" w:type="dxa"/>
             <w:shd w:val="clear" w:color="auto" w:fill="D9E2F3"/>
           </w:tcPr>
           <w:p>
@@ -4146,7 +4146,7 @@
         </w:tc>
         <w:tc>
           <w:tcPr>
-            <w:tcW w:w="1055" w:type="dxa"/>
+            <w:tcW w:w="1180" w:type="dxa"/>
             <w:shd w:val="clear" w:color="auto" w:fill="D9E2F3"/>
           </w:tcPr>
           <w:p>
@@ -4165,7 +4165,7 @@
         </w:tc>
         <w:tc>
           <w:tcPr>
-            <w:tcW w:w="1118" w:type="dxa"/>
+            <w:tcW w:w="1250" w:type="dxa"/>
             <w:shd w:val="clear" w:color="auto" w:fill="D9E2F3"/>
           </w:tcPr>
           <w:p>
@@ -4189,7 +4189,7 @@
         </w:trPr>
         <w:tc>
           <w:tcPr>
-            <w:tcW w:w="936" w:type="dxa"/>
+            <w:tcW w:w="1047" w:type="dxa"/>
           </w:tcPr>
           <w:p>
             <w:pPr>
@@ -4206,7 +4206,7 @@
         </w:tc>
         <w:tc>
           <w:tcPr>
-            <w:tcW w:w="2541" w:type="dxa"/>
+            <w:tcW w:w="2841" w:type="dxa"/>
           </w:tcPr>
           <w:p>
             <w:pPr>
@@ -4223,7 +4223,7 @@
         </w:tc>
         <w:tc>
           <w:tcPr>
-            <w:tcW w:w="2254" w:type="dxa"/>
+            <w:tcW w:w="2520" w:type="dxa"/>
           </w:tcPr>
           <w:p>
             <w:pPr>
@@ -4240,7 +4240,7 @@
         </w:tc>
         <w:tc>
           <w:tcPr>
-            <w:tcW w:w="1055" w:type="dxa"/>
+            <w:tcW w:w="1180" w:type="dxa"/>
           </w:tcPr>
           <w:p>
             <w:pPr>
@@ -4257,7 +4257,7 @@
         </w:tc>
         <w:tc>
           <w:tcPr>
-            <w:tcW w:w="1118" w:type="dxa"/>
+            <w:tcW w:w="1250" w:type="dxa"/>
           </w:tcPr>
           <w:p>
             <w:pPr>
@@ -4279,7 +4279,7 @@
         </w:trPr>
         <w:tc>
           <w:tcPr>
-            <w:tcW w:w="936" w:type="dxa"/>
+            <w:tcW w:w="1047" w:type="dxa"/>
           </w:tcPr>
           <w:p>
             <w:pPr>
@@ -4296,7 +4296,7 @@
         </w:tc>
         <w:tc>
           <w:tcPr>
-            <w:tcW w:w="2541" w:type="dxa"/>
+            <w:tcW w:w="2841" w:type="dxa"/>
           </w:tcPr>
           <w:p>
             <w:pPr>
@@ -4313,7 +4313,7 @@
         </w:tc>
         <w:tc>
           <w:tcPr>
-            <w:tcW w:w="2254" w:type="dxa"/>
+            <w:tcW w:w="2520" w:type="dxa"/>
           </w:tcPr>
           <w:p>
             <w:pPr>
@@ -4330,7 +4330,7 @@
         </w:tc>
         <w:tc>
           <w:tcPr>
-            <w:tcW w:w="1055" w:type="dxa"/>
+            <w:tcW w:w="1180" w:type="dxa"/>
           </w:tcPr>
           <w:p>
             <w:pPr>
@@ -4347,7 +4347,7 @@
         </w:tc>
         <w:tc>
           <w:tcPr>
-            <w:tcW w:w="1118" w:type="dxa"/>
+            <w:tcW w:w="1250" w:type="dxa"/>
           </w:tcPr>
           <w:p>
             <w:pPr>
@@ -4369,7 +4369,7 @@
         </w:trPr>
         <w:tc>
           <w:tcPr>
-            <w:tcW w:w="936" w:type="dxa"/>
+            <w:tcW w:w="1047" w:type="dxa"/>
           </w:tcPr>
           <w:p>
             <w:pPr>
@@ -4386,7 +4386,7 @@
         </w:tc>
         <w:tc>
           <w:tcPr>
-            <w:tcW w:w="2541" w:type="dxa"/>
+            <w:tcW w:w="2841" w:type="dxa"/>
           </w:tcPr>
           <w:p>
             <w:pPr>
@@ -4403,7 +4403,7 @@
         </w:tc>
         <w:tc>
           <w:tcPr>
-            <w:tcW w:w="2254" w:type="dxa"/>
+            <w:tcW w:w="2520" w:type="dxa"/>
           </w:tcPr>
           <w:p>
             <w:pPr>
@@ -4420,7 +4420,7 @@
         </w:tc>
         <w:tc>
           <w:tcPr>
-            <w:tcW w:w="1055" w:type="dxa"/>
+            <w:tcW w:w="1180" w:type="dxa"/>
           </w:tcPr>
           <w:p>
             <w:pPr>
@@ -4437,7 +4437,7 @@
         </w:tc>
         <w:tc>
           <w:tcPr>
-            <w:tcW w:w="1118" w:type="dxa"/>
+            <w:tcW w:w="1250" w:type="dxa"/>
           </w:tcPr>
           <w:p>
             <w:pPr>
@@ -4459,7 +4459,7 @@
         </w:trPr>
         <w:tc>
           <w:tcPr>
-            <w:tcW w:w="936" w:type="dxa"/>
+            <w:tcW w:w="1047" w:type="dxa"/>
           </w:tcPr>
           <w:p>
             <w:pPr>
@@ -4476,7 +4476,7 @@
         </w:tc>
         <w:tc>
           <w:tcPr>
-            <w:tcW w:w="2541" w:type="dxa"/>
+            <w:tcW w:w="2841" w:type="dxa"/>
           </w:tcPr>
           <w:p>
             <w:pPr>
@@ -4493,7 +4493,7 @@
         </w:tc>
         <w:tc>
           <w:tcPr>
-            <w:tcW w:w="2254" w:type="dxa"/>
+            <w:tcW w:w="2520" w:type="dxa"/>
           </w:tcPr>
           <w:p>
             <w:pPr>
@@ -4510,7 +4510,7 @@
         </w:tc>
         <w:tc>
           <w:tcPr>
-            <w:tcW w:w="1055" w:type="dxa"/>
+            <w:tcW w:w="1180" w:type="dxa"/>
           </w:tcPr>
           <w:p>
             <w:pPr>
@@ -4527,7 +4527,7 @@
         </w:tc>
         <w:tc>
           <w:tcPr>
-            <w:tcW w:w="1118" w:type="dxa"/>
+            <w:tcW w:w="1250" w:type="dxa"/>
           </w:tcPr>
           <w:p>
             <w:pPr>
@@ -4549,7 +4549,7 @@
         </w:trPr>
         <w:tc>
           <w:tcPr>
-            <w:tcW w:w="936" w:type="dxa"/>
+            <w:tcW w:w="1047" w:type="dxa"/>
           </w:tcPr>
           <w:p>
             <w:pPr>
@@ -4566,7 +4566,7 @@
         </w:tc>
         <w:tc>
           <w:tcPr>
-            <w:tcW w:w="2541" w:type="dxa"/>
+            <w:tcW w:w="2841" w:type="dxa"/>
           </w:tcPr>
           <w:p>
             <w:pPr>
@@ -4583,7 +4583,7 @@
         </w:tc>
         <w:tc>
           <w:tcPr>
-            <w:tcW w:w="2254" w:type="dxa"/>
+            <w:tcW w:w="2520" w:type="dxa"/>
           </w:tcPr>
           <w:p>
             <w:pPr>
@@ -4600,7 +4600,7 @@
         </w:tc>
         <w:tc>
           <w:tcPr>
-            <w:tcW w:w="1055" w:type="dxa"/>
+            <w:tcW w:w="1180" w:type="dxa"/>
           </w:tcPr>
           <w:p>
             <w:pPr>
@@ -4617,7 +4617,7 @@
         </w:tc>
         <w:tc>
           <w:tcPr>
-            <w:tcW w:w="1118" w:type="dxa"/>
+            <w:tcW w:w="1250" w:type="dxa"/>
           </w:tcPr>
           <w:p>
             <w:pPr>
@@ -4639,7 +4639,7 @@
         </w:trPr>
         <w:tc>
           <w:tcPr>
-            <w:tcW w:w="936" w:type="dxa"/>
+            <w:tcW w:w="1047" w:type="dxa"/>
           </w:tcPr>
           <w:p>
             <w:pPr>
@@ -4656,7 +4656,7 @@
         </w:tc>
         <w:tc>
           <w:tcPr>
-            <w:tcW w:w="2541" w:type="dxa"/>
+            <w:tcW w:w="2841" w:type="dxa"/>
           </w:tcPr>
           <w:p>
             <w:pPr>
@@ -4673,7 +4673,7 @@
         </w:tc>
         <w:tc>
           <w:tcPr>
-            <w:tcW w:w="2254" w:type="dxa"/>
+            <w:tcW w:w="2520" w:type="dxa"/>
           </w:tcPr>
           <w:p>
             <w:pPr>
@@ -4690,7 +4690,7 @@
         </w:tc>
         <w:tc>
           <w:tcPr>
-            <w:tcW w:w="1055" w:type="dxa"/>
+            <w:tcW w:w="1180" w:type="dxa"/>
           </w:tcPr>
           <w:p>
             <w:pPr>
@@ -4707,7 +4707,7 @@
         </w:tc>
         <w:tc>
           <w:tcPr>
-            <w:tcW w:w="1118" w:type="dxa"/>
+            <w:tcW w:w="1250" w:type="dxa"/>
           </w:tcPr>
           <w:p>
             <w:pPr>
@@ -4729,7 +4729,7 @@
         </w:trPr>
         <w:tc>
           <w:tcPr>
-            <w:tcW w:w="936" w:type="dxa"/>
+            <w:tcW w:w="1047" w:type="dxa"/>
           </w:tcPr>
           <w:p>
             <w:pPr>
@@ -4746,7 +4746,7 @@
         </w:tc>
         <w:tc>
           <w:tcPr>
-            <w:tcW w:w="2541" w:type="dxa"/>
+            <w:tcW w:w="2841" w:type="dxa"/>
           </w:tcPr>
           <w:p>
             <w:pPr>
@@ -4763,7 +4763,7 @@
         </w:tc>
         <w:tc>
           <w:tcPr>
-            <w:tcW w:w="2254" w:type="dxa"/>
+            <w:tcW w:w="2520" w:type="dxa"/>
           </w:tcPr>
           <w:p>
             <w:pPr>
@@ -4780,7 +4780,7 @@
         </w:tc>
         <w:tc>
           <w:tcPr>
-            <w:tcW w:w="1055" w:type="dxa"/>
+            <w:tcW w:w="1180" w:type="dxa"/>
           </w:tcPr>
           <w:p>
             <w:pPr>
@@ -4797,7 +4797,7 @@
         </w:tc>
         <w:tc>
           <w:tcPr>
-            <w:tcW w:w="1118" w:type="dxa"/>
+            <w:tcW w:w="1250" w:type="dxa"/>
           </w:tcPr>
           <w:p>
             <w:pPr>
@@ -4819,7 +4819,7 @@
         </w:trPr>
         <w:tc>
           <w:tcPr>
-            <w:tcW w:w="936" w:type="dxa"/>
+            <w:tcW w:w="1047" w:type="dxa"/>
           </w:tcPr>
           <w:p>
             <w:pPr>
@@ -4836,7 +4836,7 @@
         </w:tc>
         <w:tc>
           <w:tcPr>
-            <w:tcW w:w="2541" w:type="dxa"/>
+            <w:tcW w:w="2841" w:type="dxa"/>
           </w:tcPr>
           <w:p>
             <w:pPr>
@@ -4853,7 +4853,7 @@
         </w:tc>
         <w:tc>
           <w:tcPr>
-            <w:tcW w:w="2254" w:type="dxa"/>
+            <w:tcW w:w="2520" w:type="dxa"/>
           </w:tcPr>
           <w:p>
             <w:pPr>
@@ -4870,7 +4870,7 @@
         </w:tc>
         <w:tc>
           <w:tcPr>
-            <w:tcW w:w="1055" w:type="dxa"/>
+            <w:tcW w:w="1180" w:type="dxa"/>
           </w:tcPr>
           <w:p>
             <w:pPr>
@@ -4887,7 +4887,7 @@
         </w:tc>
         <w:tc>
           <w:tcPr>
-            <w:tcW w:w="1118" w:type="dxa"/>
+            <w:tcW w:w="1250" w:type="dxa"/>
           </w:tcPr>
           <w:p>
             <w:pPr>
@@ -4944,8 +4944,8 @@
         </w:tblBorders>
       </w:tblPr>
       <w:tblGrid>
-        <w:gridCol w:w="2926"/>
-        <w:gridCol w:w="4989"/>
+        <w:gridCol w:w="3267"/>
+        <w:gridCol w:w="5571"/>
       </w:tblGrid>
       <w:tr>
         <w:trPr>
@@ -4954,7 +4954,7 @@
         </w:trPr>
         <w:tc>
           <w:tcPr>
-            <w:tcW w:w="2926" w:type="dxa"/>
+            <w:tcW w:w="3267" w:type="dxa"/>
             <w:shd w:val="clear" w:color="auto" w:fill="D9E2F3"/>
           </w:tcPr>
           <w:p>
@@ -4973,7 +4973,7 @@
         </w:tc>
         <w:tc>
           <w:tcPr>
-            <w:tcW w:w="4989" w:type="dxa"/>
+            <w:tcW w:w="5571" w:type="dxa"/>
             <w:shd w:val="clear" w:color="auto" w:fill="D9E2F3"/>
           </w:tcPr>
           <w:p>
@@ -4997,7 +4997,7 @@
         </w:trPr>
         <w:tc>
           <w:tcPr>
-            <w:tcW w:w="2926" w:type="dxa"/>
+            <w:tcW w:w="3267" w:type="dxa"/>
           </w:tcPr>
           <w:p>
             <w:pPr>
@@ -5014,7 +5014,7 @@
         </w:tc>
         <w:tc>
           <w:tcPr>
-            <w:tcW w:w="4989" w:type="dxa"/>
+            <w:tcW w:w="5571" w:type="dxa"/>
           </w:tcPr>
           <w:p>
             <w:pPr>
@@ -5036,7 +5036,7 @@
         </w:trPr>
         <w:tc>
           <w:tcPr>
-            <w:tcW w:w="2926" w:type="dxa"/>
+            <w:tcW w:w="3267" w:type="dxa"/>
           </w:tcPr>
           <w:p>
             <w:pPr>
@@ -5053,7 +5053,7 @@
         </w:tc>
         <w:tc>
           <w:tcPr>
-            <w:tcW w:w="4989" w:type="dxa"/>
+            <w:tcW w:w="5571" w:type="dxa"/>
           </w:tcPr>
           <w:p>
             <w:pPr>
@@ -5075,7 +5075,7 @@
         </w:trPr>
         <w:tc>
           <w:tcPr>
-            <w:tcW w:w="2926" w:type="dxa"/>
+            <w:tcW w:w="3267" w:type="dxa"/>
           </w:tcPr>
           <w:p>
             <w:pPr>
@@ -5092,7 +5092,7 @@
         </w:tc>
         <w:tc>
           <w:tcPr>
-            <w:tcW w:w="4989" w:type="dxa"/>
+            <w:tcW w:w="5571" w:type="dxa"/>
           </w:tcPr>
           <w:p>
             <w:pPr>
@@ -5114,7 +5114,7 @@
         </w:trPr>
         <w:tc>
           <w:tcPr>
-            <w:tcW w:w="2926" w:type="dxa"/>
+            <w:tcW w:w="3267" w:type="dxa"/>
           </w:tcPr>
           <w:p>
             <w:pPr>
@@ -5131,7 +5131,7 @@
         </w:tc>
         <w:tc>
           <w:tcPr>
-            <w:tcW w:w="4989" w:type="dxa"/>
+            <w:tcW w:w="5571" w:type="dxa"/>
           </w:tcPr>
           <w:p>
             <w:pPr>
@@ -5153,7 +5153,7 @@
         </w:trPr>
         <w:tc>
           <w:tcPr>
-            <w:tcW w:w="2926" w:type="dxa"/>
+            <w:tcW w:w="3267" w:type="dxa"/>
           </w:tcPr>
           <w:p>
             <w:pPr>
@@ -5170,7 +5170,7 @@
         </w:tc>
         <w:tc>
           <w:tcPr>
-            <w:tcW w:w="4989" w:type="dxa"/>
+            <w:tcW w:w="5571" w:type="dxa"/>
           </w:tcPr>
           <w:p>
             <w:pPr>
@@ -5192,7 +5192,7 @@
         </w:trPr>
         <w:tc>
           <w:tcPr>
-            <w:tcW w:w="2926" w:type="dxa"/>
+            <w:tcW w:w="3267" w:type="dxa"/>
           </w:tcPr>
           <w:p>
             <w:pPr>
@@ -5209,7 +5209,7 @@
         </w:tc>
         <w:tc>
           <w:tcPr>
-            <w:tcW w:w="4989" w:type="dxa"/>
+            <w:tcW w:w="5571" w:type="dxa"/>
           </w:tcPr>
           <w:p>
             <w:pPr>
@@ -5231,7 +5231,7 @@
         </w:trPr>
         <w:tc>
           <w:tcPr>
-            <w:tcW w:w="2926" w:type="dxa"/>
+            <w:tcW w:w="3267" w:type="dxa"/>
           </w:tcPr>
           <w:p>
             <w:pPr>
@@ -5248,7 +5248,7 @@
         </w:tc>
         <w:tc>
           <w:tcPr>
-            <w:tcW w:w="4989" w:type="dxa"/>
+            <w:tcW w:w="5571" w:type="dxa"/>
           </w:tcPr>
           <w:p>
             <w:pPr>

</xml_diff>